<commit_message>
fix: correct business stationery rendering, page flow and field gaps
- Render Latin footer placeholders (Arabic font had no Latin glyphs) and add page numbers
- Right-align Arabic text (jc was resolving to the start edge in bidi paragraphs)
- Replace hard page breaks with keep-with-next flow; section bands become table rows
- Put OOXML child elements in schema order and separate adjacent tables for Word
- Add placeholder-only fields: tax identifiers, supplier contact, notes and terms,
  requesting organization, buyer details, shipping terms; drop duplicate quote validity
- Add export-pdf.sh (fonts loaded into a throwaway LibreOffice profile)
- README: remove-before-issue note and accurate test scope; review status and gates unchanged
</commit_message>
<xml_diff>
--- a/documents/working/business-stationery-20261027/GEM_Business_Letterhead_Template_working.docx
+++ b/documents/working/business-stationery-20261027/GEM_Business_Letterhead_Template_working.docx
@@ -4,9 +4,9 @@
   <w:body>
     <w:p>
       <w:pPr>
+        <w:keepNext/>
+        <w:spacing w:before="0" w:after="35" w:line="250" w:lineRule="auto"/>
         <w:jc w:val="left"/>
-        <w:spacing w:before="0" w:after="35" w:line="250" w:lineRule="auto"/>
-        <w:keepNext/>
       </w:pPr>
       <w:r>
         <w:rPr>
@@ -23,9 +23,10 @@
     </w:p>
     <w:p>
       <w:pPr>
+        <w:pStyle w:val="Title"/>
+        <w:keepNext/>
+        <w:spacing w:before="0" w:after="0" w:line="250" w:lineRule="auto"/>
         <w:jc w:val="left"/>
-        <w:spacing w:before="0" w:after="0" w:line="250" w:lineRule="auto"/>
-        <w:keepNext/>
       </w:pPr>
       <w:r>
         <w:rPr>
@@ -40,27 +41,27 @@
     </w:p>
     <w:p>
       <w:pPr>
+        <w:keepNext/>
         <w:bidi w:val="1"/>
-        <w:jc w:val="right"/>
         <w:spacing w:before="0" w:after="75" w:line="250" w:lineRule="auto"/>
-        <w:keepNext/>
+        <w:jc w:val="left"/>
       </w:pPr>
       <w:r>
         <w:rPr>
           <w:rFonts w:ascii="Noto Sans Arabic" w:hAnsi="Noto Sans Arabic" w:eastAsia="Noto Sans Arabic" w:cs="Noto Sans Arabic"/>
-          <w:rtl w:val="1"/>
           <w:color w:val="12171D"/>
           <w:sz w:val="34"/>
           <w:szCs w:val="34"/>
-          <w:lang w:val="ar-SA" w:eastAsia="ar-SA"/>
+          <w:rtl w:val="1"/>
+          <w:lang w:val="ar-SA" w:bidi="ar-SA"/>
         </w:rPr>
         <w:t xml:space="preserve">مراسلات الأعمال</w:t>
       </w:r>
     </w:p>
     <w:p>
       <w:pPr>
+        <w:spacing w:before="0" w:after="100" w:line="250" w:lineRule="auto"/>
         <w:jc w:val="left"/>
-        <w:spacing w:before="0" w:after="100" w:line="250" w:lineRule="auto"/>
       </w:pPr>
       <w:r>
         <w:rPr>
@@ -76,7 +77,6 @@
     <w:tbl>
       <w:tblPr>
         <w:tblW w:w="10000" w:type="dxa"/>
-        <w:tblLayout w:type="fixed"/>
         <w:tblBorders>
           <w:top w:val="single" w:sz="4" w:color="BCACA7"/>
           <w:left w:val="single" w:sz="4" w:color="BCACA7"/>
@@ -85,6 +85,7 @@
           <w:insideH w:val="single" w:sz="4" w:color="BCACA7"/>
           <w:insideV w:val="single" w:sz="4" w:color="BCACA7"/>
         </w:tblBorders>
+        <w:tblLayout w:type="fixed"/>
         <w:tblCellMar>
           <w:top w:w="75" w:type="dxa"/>
           <w:left w:w="85" w:type="dxa"/>
@@ -106,16 +107,17 @@
         <w:tc>
           <w:tcPr>
             <w:tcW w:w="1650" w:type="dxa"/>
-            <w:shd w:val="clear" w:color="auto" w:fill="F4F1F0"/>
             <w:tcBorders>
               <w:bottom w:val="single" w:sz="4" w:space="0" w:color="BCACA7"/>
             </w:tcBorders>
+            <w:shd w:val="clear" w:color="auto" w:fill="F4F1F0"/>
             <w:vAlign w:val="center"/>
           </w:tcPr>
           <w:p>
             <w:pPr>
-              <w:jc w:val="left"/>
+              <w:keepNext/>
               <w:spacing w:before="0" w:after="12" w:line="250" w:lineRule="auto"/>
+              <w:jc w:val="left"/>
             </w:pPr>
             <w:r>
               <w:rPr>
@@ -132,20 +134,19 @@
           </w:p>
           <w:p>
             <w:pPr>
+              <w:keepNext/>
               <w:bidi w:val="1"/>
-              <w:jc w:val="right"/>
               <w:spacing w:before="0" w:after="0" w:line="250" w:lineRule="auto"/>
+              <w:jc w:val="left"/>
             </w:pPr>
             <w:r>
               <w:rPr>
                 <w:rFonts w:ascii="Noto Sans Arabic" w:hAnsi="Noto Sans Arabic" w:eastAsia="Noto Sans Arabic" w:cs="Noto Sans Arabic"/>
-                <w:b/>
-                <w:bCs/>
-                <w:rtl w:val="1"/>
                 <w:color w:val="12171D"/>
                 <w:sz w:val="16"/>
                 <w:szCs w:val="16"/>
-                <w:lang w:val="ar-SA" w:eastAsia="ar-SA"/>
+                <w:rtl w:val="1"/>
+                <w:lang w:val="ar-SA" w:bidi="ar-SA"/>
               </w:rPr>
               <w:t xml:space="preserve">التاريخ</w:t>
             </w:r>
@@ -161,8 +162,9 @@
           </w:tcPr>
           <w:p>
             <w:pPr>
-              <w:jc w:val="left"/>
+              <w:keepNext/>
               <w:spacing w:before="0" w:after="0" w:line="250" w:lineRule="auto"/>
+              <w:jc w:val="left"/>
             </w:pPr>
             <w:r>
               <w:rPr>
@@ -181,16 +183,17 @@
         <w:tc>
           <w:tcPr>
             <w:tcW w:w="1650" w:type="dxa"/>
-            <w:shd w:val="clear" w:color="auto" w:fill="F4F1F0"/>
             <w:tcBorders>
               <w:bottom w:val="single" w:sz="4" w:space="0" w:color="BCACA7"/>
             </w:tcBorders>
+            <w:shd w:val="clear" w:color="auto" w:fill="F4F1F0"/>
             <w:vAlign w:val="center"/>
           </w:tcPr>
           <w:p>
             <w:pPr>
-              <w:jc w:val="left"/>
+              <w:keepNext/>
               <w:spacing w:before="0" w:after="12" w:line="250" w:lineRule="auto"/>
+              <w:jc w:val="left"/>
             </w:pPr>
             <w:r>
               <w:rPr>
@@ -207,20 +210,19 @@
           </w:p>
           <w:p>
             <w:pPr>
+              <w:keepNext/>
               <w:bidi w:val="1"/>
-              <w:jc w:val="right"/>
               <w:spacing w:before="0" w:after="0" w:line="250" w:lineRule="auto"/>
+              <w:jc w:val="left"/>
             </w:pPr>
             <w:r>
               <w:rPr>
                 <w:rFonts w:ascii="Noto Sans Arabic" w:hAnsi="Noto Sans Arabic" w:eastAsia="Noto Sans Arabic" w:cs="Noto Sans Arabic"/>
-                <w:b/>
-                <w:bCs/>
-                <w:rtl w:val="1"/>
                 <w:color w:val="12171D"/>
                 <w:sz w:val="16"/>
                 <w:szCs w:val="16"/>
-                <w:lang w:val="ar-SA" w:eastAsia="ar-SA"/>
+                <w:rtl w:val="1"/>
+                <w:lang w:val="ar-SA" w:bidi="ar-SA"/>
               </w:rPr>
               <w:t xml:space="preserve">المرجع</w:t>
             </w:r>
@@ -236,8 +238,9 @@
           </w:tcPr>
           <w:p>
             <w:pPr>
-              <w:jc w:val="left"/>
+              <w:keepNext/>
               <w:spacing w:before="0" w:after="0" w:line="250" w:lineRule="auto"/>
+              <w:jc w:val="left"/>
             </w:pPr>
             <w:r>
               <w:rPr>
@@ -261,16 +264,17 @@
         <w:tc>
           <w:tcPr>
             <w:tcW w:w="1650" w:type="dxa"/>
-            <w:shd w:val="clear" w:color="auto" w:fill="F4F1F0"/>
             <w:tcBorders>
               <w:bottom w:val="single" w:sz="4" w:space="0" w:color="BCACA7"/>
             </w:tcBorders>
+            <w:shd w:val="clear" w:color="auto" w:fill="F4F1F0"/>
             <w:vAlign w:val="center"/>
           </w:tcPr>
           <w:p>
             <w:pPr>
-              <w:jc w:val="left"/>
+              <w:keepNext/>
               <w:spacing w:before="0" w:after="12" w:line="250" w:lineRule="auto"/>
+              <w:jc w:val="left"/>
             </w:pPr>
             <w:r>
               <w:rPr>
@@ -287,20 +291,19 @@
           </w:p>
           <w:p>
             <w:pPr>
+              <w:keepNext/>
               <w:bidi w:val="1"/>
-              <w:jc w:val="right"/>
               <w:spacing w:before="0" w:after="0" w:line="250" w:lineRule="auto"/>
+              <w:jc w:val="left"/>
             </w:pPr>
             <w:r>
               <w:rPr>
                 <w:rFonts w:ascii="Noto Sans Arabic" w:hAnsi="Noto Sans Arabic" w:eastAsia="Noto Sans Arabic" w:cs="Noto Sans Arabic"/>
-                <w:b/>
-                <w:bCs/>
-                <w:rtl w:val="1"/>
                 <w:color w:val="12171D"/>
                 <w:sz w:val="16"/>
                 <w:szCs w:val="16"/>
-                <w:lang w:val="ar-SA" w:eastAsia="ar-SA"/>
+                <w:rtl w:val="1"/>
+                <w:lang w:val="ar-SA" w:bidi="ar-SA"/>
               </w:rPr>
               <w:t xml:space="preserve">المستلم</w:t>
             </w:r>
@@ -316,8 +319,9 @@
           </w:tcPr>
           <w:p>
             <w:pPr>
-              <w:jc w:val="left"/>
+              <w:keepNext/>
               <w:spacing w:before="0" w:after="0" w:line="250" w:lineRule="auto"/>
+              <w:jc w:val="left"/>
             </w:pPr>
             <w:r>
               <w:rPr>
@@ -336,16 +340,17 @@
         <w:tc>
           <w:tcPr>
             <w:tcW w:w="1650" w:type="dxa"/>
-            <w:shd w:val="clear" w:color="auto" w:fill="F4F1F0"/>
             <w:tcBorders>
               <w:bottom w:val="single" w:sz="4" w:space="0" w:color="BCACA7"/>
             </w:tcBorders>
+            <w:shd w:val="clear" w:color="auto" w:fill="F4F1F0"/>
             <w:vAlign w:val="center"/>
           </w:tcPr>
           <w:p>
             <w:pPr>
-              <w:jc w:val="left"/>
+              <w:keepNext/>
               <w:spacing w:before="0" w:after="12" w:line="250" w:lineRule="auto"/>
+              <w:jc w:val="left"/>
             </w:pPr>
             <w:r>
               <w:rPr>
@@ -362,20 +367,19 @@
           </w:p>
           <w:p>
             <w:pPr>
+              <w:keepNext/>
               <w:bidi w:val="1"/>
-              <w:jc w:val="right"/>
               <w:spacing w:before="0" w:after="0" w:line="250" w:lineRule="auto"/>
+              <w:jc w:val="left"/>
             </w:pPr>
             <w:r>
               <w:rPr>
                 <w:rFonts w:ascii="Noto Sans Arabic" w:hAnsi="Noto Sans Arabic" w:eastAsia="Noto Sans Arabic" w:cs="Noto Sans Arabic"/>
-                <w:b/>
-                <w:bCs/>
-                <w:rtl w:val="1"/>
                 <w:color w:val="12171D"/>
                 <w:sz w:val="16"/>
                 <w:szCs w:val="16"/>
-                <w:lang w:val="ar-SA" w:eastAsia="ar-SA"/>
+                <w:rtl w:val="1"/>
+                <w:lang w:val="ar-SA" w:bidi="ar-SA"/>
               </w:rPr>
               <w:t xml:space="preserve">المنشأة</w:t>
             </w:r>
@@ -391,8 +395,9 @@
           </w:tcPr>
           <w:p>
             <w:pPr>
-              <w:jc w:val="left"/>
+              <w:keepNext/>
               <w:spacing w:before="0" w:after="0" w:line="250" w:lineRule="auto"/>
+              <w:jc w:val="left"/>
             </w:pPr>
             <w:r>
               <w:rPr>
@@ -416,16 +421,16 @@
         <w:tc>
           <w:tcPr>
             <w:tcW w:w="1650" w:type="dxa"/>
-            <w:shd w:val="clear" w:color="auto" w:fill="F4F1F0"/>
             <w:tcBorders>
               <w:bottom w:val="single" w:sz="4" w:space="0" w:color="BCACA7"/>
             </w:tcBorders>
+            <w:shd w:val="clear" w:color="auto" w:fill="F4F1F0"/>
             <w:vAlign w:val="center"/>
           </w:tcPr>
           <w:p>
             <w:pPr>
-              <w:jc w:val="left"/>
               <w:spacing w:before="0" w:after="12" w:line="250" w:lineRule="auto"/>
+              <w:jc w:val="left"/>
             </w:pPr>
             <w:r>
               <w:rPr>
@@ -443,19 +448,17 @@
           <w:p>
             <w:pPr>
               <w:bidi w:val="1"/>
-              <w:jc w:val="right"/>
               <w:spacing w:before="0" w:after="0" w:line="250" w:lineRule="auto"/>
+              <w:jc w:val="left"/>
             </w:pPr>
             <w:r>
               <w:rPr>
                 <w:rFonts w:ascii="Noto Sans Arabic" w:hAnsi="Noto Sans Arabic" w:eastAsia="Noto Sans Arabic" w:cs="Noto Sans Arabic"/>
-                <w:b/>
-                <w:bCs/>
-                <w:rtl w:val="1"/>
                 <w:color w:val="12171D"/>
                 <w:sz w:val="16"/>
                 <w:szCs w:val="16"/>
-                <w:lang w:val="ar-SA" w:eastAsia="ar-SA"/>
+                <w:rtl w:val="1"/>
+                <w:lang w:val="ar-SA" w:bidi="ar-SA"/>
               </w:rPr>
               <w:t xml:space="preserve">العنوان</w:t>
             </w:r>
@@ -471,8 +474,8 @@
           </w:tcPr>
           <w:p>
             <w:pPr>
-              <w:jc w:val="left"/>
               <w:spacing w:before="0" w:after="0" w:line="250" w:lineRule="auto"/>
+              <w:jc w:val="left"/>
             </w:pPr>
             <w:r>
               <w:rPr>
@@ -491,16 +494,16 @@
         <w:tc>
           <w:tcPr>
             <w:tcW w:w="1650" w:type="dxa"/>
-            <w:shd w:val="clear" w:color="auto" w:fill="F4F1F0"/>
             <w:tcBorders>
               <w:bottom w:val="single" w:sz="4" w:space="0" w:color="BCACA7"/>
             </w:tcBorders>
+            <w:shd w:val="clear" w:color="auto" w:fill="F4F1F0"/>
             <w:vAlign w:val="center"/>
           </w:tcPr>
           <w:p>
             <w:pPr>
-              <w:jc w:val="left"/>
               <w:spacing w:before="0" w:after="12" w:line="250" w:lineRule="auto"/>
+              <w:jc w:val="left"/>
             </w:pPr>
             <w:r>
               <w:rPr>
@@ -518,19 +521,17 @@
           <w:p>
             <w:pPr>
               <w:bidi w:val="1"/>
-              <w:jc w:val="right"/>
               <w:spacing w:before="0" w:after="0" w:line="250" w:lineRule="auto"/>
+              <w:jc w:val="left"/>
             </w:pPr>
             <w:r>
               <w:rPr>
                 <w:rFonts w:ascii="Noto Sans Arabic" w:hAnsi="Noto Sans Arabic" w:eastAsia="Noto Sans Arabic" w:cs="Noto Sans Arabic"/>
-                <w:b/>
-                <w:bCs/>
-                <w:rtl w:val="1"/>
                 <w:color w:val="12171D"/>
                 <w:sz w:val="16"/>
                 <w:szCs w:val="16"/>
-                <w:lang w:val="ar-SA" w:eastAsia="ar-SA"/>
+                <w:rtl w:val="1"/>
+                <w:lang w:val="ar-SA" w:bidi="ar-SA"/>
               </w:rPr>
               <w:t xml:space="preserve">الموضوع</w:t>
             </w:r>
@@ -546,8 +547,8 @@
           </w:tcPr>
           <w:p>
             <w:pPr>
-              <w:jc w:val="left"/>
               <w:spacing w:before="0" w:after="0" w:line="250" w:lineRule="auto"/>
+              <w:jc w:val="left"/>
             </w:pPr>
             <w:r>
               <w:rPr>
@@ -567,8 +568,17 @@
     </w:tbl>
     <w:p>
       <w:pPr>
+        <w:spacing w:before="0" w:after="0" w:line="20" w:lineRule="exact"/>
+        <w:rPr>
+          <w:sz w:val="2"/>
+          <w:szCs w:val="2"/>
+        </w:rPr>
+      </w:pPr>
+    </w:p>
+    <w:p>
+      <w:pPr>
+        <w:spacing w:before="130" w:after="100" w:line="250" w:lineRule="auto"/>
         <w:jc w:val="left"/>
-        <w:spacing w:before="130" w:after="100" w:line="250" w:lineRule="auto"/>
       </w:pPr>
       <w:r>
         <w:rPr>
@@ -583,8 +593,8 @@
     </w:p>
     <w:p>
       <w:pPr>
+        <w:spacing w:before="0" w:after="120" w:line="250" w:lineRule="auto"/>
         <w:jc w:val="left"/>
-        <w:spacing w:before="0" w:after="120" w:line="250" w:lineRule="auto"/>
       </w:pPr>
       <w:r>
         <w:rPr>
@@ -599,8 +609,8 @@
     </w:p>
     <w:p>
       <w:pPr>
+        <w:spacing w:before="0" w:after="150" w:line="250" w:lineRule="auto"/>
         <w:jc w:val="left"/>
-        <w:spacing w:before="0" w:after="150" w:line="250" w:lineRule="auto"/>
       </w:pPr>
       <w:r>
         <w:rPr>
@@ -615,8 +625,8 @@
     </w:p>
     <w:p>
       <w:pPr>
+        <w:spacing w:before="0" w:after="25" w:line="250" w:lineRule="auto"/>
         <w:jc w:val="left"/>
-        <w:spacing w:before="0" w:after="25" w:line="250" w:lineRule="auto"/>
       </w:pPr>
       <w:r>
         <w:rPr>
@@ -633,8 +643,8 @@
     </w:p>
     <w:p>
       <w:pPr>
+        <w:spacing w:before="0" w:after="0" w:line="250" w:lineRule="auto"/>
         <w:jc w:val="left"/>
-        <w:spacing w:before="0" w:after="0" w:line="250" w:lineRule="auto"/>
       </w:pPr>
       <w:r>
         <w:rPr>
@@ -670,29 +680,242 @@
     </w:pPr>
     <w:r>
       <w:rPr>
-        <w:rFonts w:ascii="Inter" w:hAnsi="Inter"/>
+        <w:rFonts w:ascii="Inter" w:hAnsi="Inter" w:cs="Inter"/>
         <w:color w:val="12171D"/>
-        <w:sz w:val="13"/>
+        <w:sz w:val="15"/>
+        <w:szCs w:val="15"/>
+        <w:lang w:val="en-GB"/>
       </w:rPr>
-      <w:t>[Registered Entity Name] | [Company Address] | contact@mish3l.com | [Business Phone]</w:t>
+      <w:t xml:space="preserve">[Registered Entity Name] | [Company Address] | contact@mish3l.com | [Business Phone]</w:t>
     </w:r>
   </w:p>
+  <w:tbl>
+    <w:tblPr>
+      <w:tblW w:w="10000" w:type="dxa"/>
+      <w:tblInd w:w="-85" w:type="dxa"/>
+      <w:tblBorders>
+        <w:top w:val="nil"/>
+        <w:left w:val="nil"/>
+        <w:bottom w:val="nil"/>
+        <w:right w:val="nil"/>
+        <w:insideH w:val="nil"/>
+        <w:insideV w:val="nil"/>
+      </w:tblBorders>
+      <w:tblLayout w:type="fixed"/>
+      <w:tblCellMar>
+        <w:top w:w="75" w:type="dxa"/>
+        <w:left w:w="85" w:type="dxa"/>
+        <w:bottom w:w="75" w:type="dxa"/>
+        <w:right w:w="85" w:type="dxa"/>
+      </w:tblCellMar>
+      <w:tblLook w:firstRow="1" w:lastRow="0" w:firstColumn="0" w:lastColumn="0" w:noHBand="0" w:noVBand="1"/>
+    </w:tblPr>
+    <w:tblGrid>
+      <w:gridCol w:w="3000"/>
+      <w:gridCol w:w="7000"/>
+    </w:tblGrid>
+    <w:tr>
+      <w:trPr>
+        <w:cantSplit/>
+      </w:trPr>
+      <w:tc>
+        <w:tcPr>
+          <w:tcW w:w="3000" w:type="dxa"/>
+          <w:vAlign w:val="top"/>
+        </w:tcPr>
+        <w:p>
+          <w:pPr>
+            <w:spacing w:before="0" w:after="0"/>
+          </w:pPr>
+          <w:r>
+            <w:rPr>
+              <w:rFonts w:ascii="Inter" w:hAnsi="Inter" w:cs="Inter"/>
+              <w:color w:val="12171D"/>
+              <w:sz w:val="15"/>
+              <w:szCs w:val="15"/>
+              <w:lang w:val="en-GB"/>
+            </w:rPr>
+            <w:t xml:space="preserve">Page </w:t>
+          </w:r>
+          <w:r>
+            <w:rPr>
+              <w:rFonts w:ascii="Inter" w:hAnsi="Inter" w:cs="Inter"/>
+              <w:color w:val="12171D"/>
+              <w:sz w:val="15"/>
+              <w:szCs w:val="15"/>
+            </w:rPr>
+            <w:fldChar w:fldCharType="begin"/>
+          </w:r>
+          <w:r>
+            <w:rPr>
+              <w:rFonts w:ascii="Inter" w:hAnsi="Inter" w:cs="Inter"/>
+              <w:color w:val="12171D"/>
+              <w:sz w:val="15"/>
+              <w:szCs w:val="15"/>
+            </w:rPr>
+            <w:instrText xml:space="preserve"> PAGE </w:instrText>
+          </w:r>
+          <w:r>
+            <w:rPr>
+              <w:rFonts w:ascii="Inter" w:hAnsi="Inter" w:cs="Inter"/>
+              <w:color w:val="12171D"/>
+              <w:sz w:val="15"/>
+              <w:szCs w:val="15"/>
+            </w:rPr>
+            <w:fldChar w:fldCharType="separate"/>
+          </w:r>
+          <w:r>
+            <w:rPr>
+              <w:rFonts w:ascii="Inter" w:hAnsi="Inter" w:cs="Inter"/>
+              <w:color w:val="12171D"/>
+              <w:sz w:val="15"/>
+              <w:szCs w:val="15"/>
+              <w:lang w:val="en-GB"/>
+            </w:rPr>
+            <w:t xml:space="preserve">1</w:t>
+          </w:r>
+          <w:r>
+            <w:rPr>
+              <w:rFonts w:ascii="Inter" w:hAnsi="Inter" w:cs="Inter"/>
+              <w:color w:val="12171D"/>
+              <w:sz w:val="15"/>
+              <w:szCs w:val="15"/>
+            </w:rPr>
+            <w:fldChar w:fldCharType="end"/>
+          </w:r>
+          <w:r>
+            <w:rPr>
+              <w:rFonts w:ascii="Inter" w:hAnsi="Inter" w:cs="Inter"/>
+              <w:color w:val="12171D"/>
+              <w:sz w:val="15"/>
+              <w:szCs w:val="15"/>
+              <w:lang w:val="en-GB"/>
+            </w:rPr>
+            <w:t xml:space="preserve"> of </w:t>
+          </w:r>
+          <w:r>
+            <w:rPr>
+              <w:rFonts w:ascii="Inter" w:hAnsi="Inter" w:cs="Inter"/>
+              <w:color w:val="12171D"/>
+              <w:sz w:val="15"/>
+              <w:szCs w:val="15"/>
+            </w:rPr>
+            <w:fldChar w:fldCharType="begin"/>
+          </w:r>
+          <w:r>
+            <w:rPr>
+              <w:rFonts w:ascii="Inter" w:hAnsi="Inter" w:cs="Inter"/>
+              <w:color w:val="12171D"/>
+              <w:sz w:val="15"/>
+              <w:szCs w:val="15"/>
+            </w:rPr>
+            <w:instrText xml:space="preserve"> NUMPAGES </w:instrText>
+          </w:r>
+          <w:r>
+            <w:rPr>
+              <w:rFonts w:ascii="Inter" w:hAnsi="Inter" w:cs="Inter"/>
+              <w:color w:val="12171D"/>
+              <w:sz w:val="15"/>
+              <w:szCs w:val="15"/>
+            </w:rPr>
+            <w:fldChar w:fldCharType="separate"/>
+          </w:r>
+          <w:r>
+            <w:rPr>
+              <w:rFonts w:ascii="Inter" w:hAnsi="Inter" w:cs="Inter"/>
+              <w:color w:val="12171D"/>
+              <w:sz w:val="15"/>
+              <w:szCs w:val="15"/>
+              <w:lang w:val="en-GB"/>
+            </w:rPr>
+            <w:t xml:space="preserve">1</w:t>
+          </w:r>
+          <w:r>
+            <w:rPr>
+              <w:rFonts w:ascii="Inter" w:hAnsi="Inter" w:cs="Inter"/>
+              <w:color w:val="12171D"/>
+              <w:sz w:val="15"/>
+              <w:szCs w:val="15"/>
+            </w:rPr>
+            <w:fldChar w:fldCharType="end"/>
+          </w:r>
+        </w:p>
+      </w:tc>
+      <w:tc>
+        <w:tcPr>
+          <w:tcW w:w="7000" w:type="dxa"/>
+          <w:vAlign w:val="top"/>
+        </w:tcPr>
+        <w:p>
+          <w:pPr>
+            <w:bidi w:val="1"/>
+            <w:spacing w:before="0" w:after="0"/>
+            <w:jc w:val="left"/>
+          </w:pPr>
+          <w:r>
+            <w:rPr>
+              <w:rFonts w:ascii="Noto Sans Arabic" w:hAnsi="Noto Sans Arabic" w:cs="Noto Sans Arabic"/>
+              <w:color w:val="12171D"/>
+              <w:sz w:val="15"/>
+              <w:szCs w:val="15"/>
+              <w:rtl/>
+              <w:lang w:val="ar-SA" w:bidi="ar-SA"/>
+            </w:rPr>
+            <w:t xml:space="preserve">الاسم المسجل: </w:t>
+          </w:r>
+          <w:r>
+            <w:rPr>
+              <w:rFonts w:ascii="Inter" w:hAnsi="Inter" w:cs="Inter"/>
+              <w:color w:val="12171D"/>
+              <w:sz w:val="15"/>
+              <w:szCs w:val="15"/>
+              <w:lang w:val="en-GB"/>
+            </w:rPr>
+            <w:t xml:space="preserve">‎[Registered Entity Name]‎</w:t>
+          </w:r>
+          <w:r>
+            <w:rPr>
+              <w:rFonts w:ascii="Inter" w:hAnsi="Inter" w:cs="Inter"/>
+              <w:color w:val="12171D"/>
+              <w:sz w:val="15"/>
+              <w:szCs w:val="15"/>
+              <w:lang w:val="en-GB"/>
+            </w:rPr>
+            <w:t xml:space="preserve"> | </w:t>
+          </w:r>
+          <w:r>
+            <w:rPr>
+              <w:rFonts w:ascii="Noto Sans Arabic" w:hAnsi="Noto Sans Arabic" w:cs="Noto Sans Arabic"/>
+              <w:color w:val="12171D"/>
+              <w:sz w:val="15"/>
+              <w:szCs w:val="15"/>
+              <w:rtl/>
+              <w:lang w:val="ar-SA" w:bidi="ar-SA"/>
+            </w:rPr>
+            <w:t xml:space="preserve">العنوان: </w:t>
+          </w:r>
+          <w:r>
+            <w:rPr>
+              <w:rFonts w:ascii="Inter" w:hAnsi="Inter" w:cs="Inter"/>
+              <w:color w:val="12171D"/>
+              <w:sz w:val="15"/>
+              <w:szCs w:val="15"/>
+              <w:lang w:val="en-GB"/>
+            </w:rPr>
+            <w:t xml:space="preserve">‎[Company Address]‎</w:t>
+          </w:r>
+        </w:p>
+      </w:tc>
+    </w:tr>
+  </w:tbl>
   <w:p>
     <w:pPr>
-      <w:bidi w:val="1"/>
-      <w:jc w:val="right"/>
-      <w:spacing w:after="0"/>
+      <w:spacing w:before="0" w:after="0" w:line="20" w:lineRule="exact"/>
+      <w:rPr>
+        <w:sz w:val="2"/>
+        <w:szCs w:val="2"/>
+      </w:rPr>
     </w:pPr>
-    <w:r>
-      <w:rPr>
-        <w:rFonts w:ascii="Noto Sans Arabic" w:hAnsi="Noto Sans Arabic" w:cs="Noto Sans Arabic"/>
-        <w:rtl/>
-        <w:color w:val="12171D"/>
-        <w:sz w:val="13"/>
-        <w:lang w:val="ar-SA"/>
-      </w:rPr>
-      <w:t>الاسم المسجل: [Registered Entity Name] | العنوان: [Company Address]</w:t>
-    </w:r>
   </w:p>
 </w:ftr>
 </file>
@@ -702,7 +925,6 @@
   <w:tbl>
     <w:tblPr>
       <w:tblW w:w="10000" w:type="dxa"/>
-      <w:tblLayout w:type="fixed"/>
       <w:tblBorders>
         <w:top w:val="nil"/>
         <w:left w:val="nil"/>
@@ -711,6 +933,7 @@
         <w:insideH w:val="nil"/>
         <w:insideV w:val="nil"/>
       </w:tblBorders>
+      <w:tblLayout w:type="fixed"/>
       <w:tblCellMar>
         <w:top w:w="75" w:type="dxa"/>
         <w:left w:w="85" w:type="dxa"/>
@@ -741,7 +964,7 @@
             <w:drawing>
               <wp:inline distT="0" distB="0" distL="0" distR="0">
                 <wp:extent cx="1664208" cy="540380"/>
-                <wp:docPr id="1" name="GEM horizontal ink logo"/>
+                <wp:docPr id="1" name="GEM horizontal ink logo" descr="GEM logo"/>
                 <wp:cNvGraphicFramePr>
                   <a:graphicFrameLocks noChangeAspect="1"/>
                 </wp:cNvGraphicFramePr>
@@ -784,8 +1007,8 @@
         </w:tcPr>
         <w:p>
           <w:pPr>
+            <w:spacing w:before="0" w:after="10" w:line="250" w:lineRule="auto"/>
             <w:jc w:val="right"/>
-            <w:spacing w:before="0" w:after="10" w:line="250" w:lineRule="auto"/>
           </w:pPr>
           <w:r>
             <w:rPr>
@@ -802,8 +1025,8 @@
         </w:p>
         <w:p>
           <w:pPr>
+            <w:spacing w:before="0" w:after="8" w:line="250" w:lineRule="auto"/>
             <w:jc w:val="right"/>
-            <w:spacing w:before="0" w:after="8" w:line="250" w:lineRule="auto"/>
           </w:pPr>
           <w:r>
             <w:rPr>
@@ -821,19 +1044,19 @@
         <w:p>
           <w:pPr>
             <w:bidi w:val="1"/>
-            <w:jc w:val="right"/>
             <w:spacing w:before="0" w:after="0" w:line="250" w:lineRule="auto"/>
+            <w:jc w:val="left"/>
           </w:pPr>
           <w:r>
             <w:rPr>
               <w:rFonts w:ascii="Noto Sans Arabic" w:hAnsi="Noto Sans Arabic" w:eastAsia="Noto Sans Arabic" w:cs="Noto Sans Arabic"/>
               <w:b/>
               <w:bCs/>
-              <w:rtl w:val="1"/>
               <w:color w:val="12171D"/>
               <w:sz w:val="14"/>
               <w:szCs w:val="14"/>
-              <w:lang w:val="ar-SA" w:eastAsia="ar-SA"/>
+              <w:rtl w:val="1"/>
+              <w:lang w:val="ar-SA" w:bidi="ar-SA"/>
             </w:rPr>
             <w:t xml:space="preserve">مسودة للمراجعة الداخلية</w:t>
           </w:r>
@@ -843,10 +1066,19 @@
   </w:tbl>
   <w:p>
     <w:pPr>
-      <w:spacing w:before="55" w:after="0"/>
+      <w:spacing w:before="0" w:after="0" w:line="20" w:lineRule="exact"/>
+      <w:rPr>
+        <w:sz w:val="2"/>
+        <w:szCs w:val="2"/>
+      </w:rPr>
+    </w:pPr>
+  </w:p>
+  <w:p>
+    <w:pPr>
       <w:pBdr>
         <w:bottom w:val="single" w:sz="8" w:space="1" w:color="BCACA7"/>
       </w:pBdr>
+      <w:spacing w:before="90" w:after="0"/>
     </w:pPr>
   </w:p>
 </w:hdr>
@@ -860,7 +1092,7 @@
         <w:rFonts w:ascii="Inter" w:hAnsi="Inter" w:eastAsia="Inter" w:cs="Noto Sans Arabic"/>
         <w:sz w:val="19"/>
         <w:szCs w:val="19"/>
-        <w:lang w:val="en-GB" w:eastAsia="ar-SA"/>
+        <w:lang w:val="en-GB" w:bidi="ar-SA"/>
       </w:rPr>
     </w:rPrDefault>
     <w:pPrDefault>
@@ -892,8 +1124,8 @@
     <w:qFormat/>
     <w:rPr>
       <w:rFonts w:ascii="Jost" w:hAnsi="Jost"/>
+      <w:b/>
       <w:color w:val="12171D"/>
-      <w:b/>
       <w:sz w:val="22"/>
     </w:rPr>
   </w:style>

</xml_diff>